<commit_message>
Added Professional Dvl Section
</commit_message>
<xml_diff>
--- a/JOSHUA D - SOFTWARE ENGINEER w_AI.docx
+++ b/JOSHUA D - SOFTWARE ENGINEER w_AI.docx
@@ -47,7 +47,15 @@
           <w:sz w:val="22"/>
           <w:szCs w:val="22"/>
         </w:rPr>
-        <w:t xml:space="preserve"> | </w:t>
+        <w:t xml:space="preserve"> </w:t>
+      </w:r>
+      <w:r>
+        <w:rPr>
+          <w:rFonts w:ascii="Garamond" w:hAnsi="Garamond"/>
+          <w:sz w:val="22"/>
+          <w:szCs w:val="22"/>
+        </w:rPr>
+        <w:t xml:space="preserve">| </w:t>
       </w:r>
       <w:r>
         <w:rPr>
@@ -124,22 +132,6 @@
         </w:rPr>
         <w:t xml:space="preserve"> </w:t>
       </w:r>
-      <w:r>
-        <w:rPr>
-          <w:rFonts w:ascii="Garamond" w:hAnsi="Garamond"/>
-          <w:sz w:val="22"/>
-          <w:szCs w:val="22"/>
-        </w:rPr>
-        <w:t>|</w:t>
-      </w:r>
-      <w:r>
-        <w:rPr>
-          <w:rFonts w:ascii="Garamond" w:hAnsi="Garamond"/>
-          <w:sz w:val="22"/>
-          <w:szCs w:val="22"/>
-        </w:rPr>
-        <w:t xml:space="preserve"> </w:t>
-      </w:r>
       <w:hyperlink r:id="rId8" w:history="1">
         <w:r>
           <w:rPr>
@@ -594,8 +586,8 @@
           <w:rFonts w:ascii="Garamond" w:hAnsi="Garamond"/>
           <w:b/>
           <w:bCs/>
-          <w:sz w:val="18"/>
-          <w:szCs w:val="18"/>
+          <w:sz w:val="16"/>
+          <w:szCs w:val="16"/>
         </w:rPr>
       </w:pPr>
     </w:p>
@@ -1060,8 +1052,8 @@
           <w:rFonts w:ascii="Garamond" w:hAnsi="Garamond"/>
           <w:b/>
           <w:bCs/>
-          <w:sz w:val="18"/>
-          <w:szCs w:val="18"/>
+          <w:sz w:val="16"/>
+          <w:szCs w:val="16"/>
         </w:rPr>
       </w:pPr>
     </w:p>
@@ -1298,6 +1290,15 @@
           <w:sz w:val="18"/>
           <w:szCs w:val="18"/>
         </w:rPr>
+        <w:t xml:space="preserve">Design of </w:t>
+      </w:r>
+      <w:r>
+        <w:rPr>
+          <w:rFonts w:ascii="Garamond" w:hAnsi="Garamond" w:cs="Calibri"/>
+          <w:color w:val="000000"/>
+          <w:sz w:val="18"/>
+          <w:szCs w:val="18"/>
+        </w:rPr>
         <w:t>Database Systems</w:t>
       </w:r>
       <w:r>
@@ -1307,6 +1308,15 @@
           <w:sz w:val="18"/>
           <w:szCs w:val="18"/>
         </w:rPr>
+        <w:t xml:space="preserve"> I and II</w:t>
+      </w:r>
+      <w:r>
+        <w:rPr>
+          <w:rFonts w:ascii="Garamond" w:hAnsi="Garamond" w:cs="Calibri"/>
+          <w:color w:val="000000"/>
+          <w:sz w:val="18"/>
+          <w:szCs w:val="18"/>
+        </w:rPr>
         <w:t xml:space="preserve">, </w:t>
       </w:r>
       <w:r>
@@ -1338,8 +1348,8 @@
           <w:rFonts w:ascii="Garamond" w:hAnsi="Garamond"/>
           <w:b/>
           <w:bCs/>
-          <w:sz w:val="18"/>
-          <w:szCs w:val="18"/>
+          <w:sz w:val="16"/>
+          <w:szCs w:val="16"/>
         </w:rPr>
       </w:pPr>
     </w:p>
@@ -1365,7 +1375,99 @@
           <w:sz w:val="18"/>
           <w:szCs w:val="18"/>
         </w:rPr>
-        <w:t>Rowan College of South Jersey - Gloucester</w:t>
+        <w:t xml:space="preserve">Rowan College of South Jersey </w:t>
+      </w:r>
+      <w:r>
+        <w:rPr>
+          <w:rFonts w:ascii="Garamond" w:hAnsi="Garamond"/>
+          <w:b/>
+          <w:bCs/>
+          <w:sz w:val="18"/>
+          <w:szCs w:val="18"/>
+        </w:rPr>
+        <w:t>–</w:t>
+      </w:r>
+      <w:r>
+        <w:rPr>
+          <w:rFonts w:ascii="Garamond" w:hAnsi="Garamond"/>
+          <w:b/>
+          <w:bCs/>
+          <w:sz w:val="18"/>
+          <w:szCs w:val="18"/>
+        </w:rPr>
+        <w:t xml:space="preserve"> Gloucester</w:t>
+      </w:r>
+      <w:r>
+        <w:rPr>
+          <w:rFonts w:ascii="Garamond" w:hAnsi="Garamond"/>
+          <w:sz w:val="18"/>
+          <w:szCs w:val="18"/>
+        </w:rPr>
+        <w:t xml:space="preserve"> : </w:t>
+      </w:r>
+      <w:r>
+        <w:rPr>
+          <w:rFonts w:ascii="Garamond" w:hAnsi="Garamond"/>
+          <w:i/>
+          <w:iCs/>
+          <w:sz w:val="18"/>
+          <w:szCs w:val="18"/>
+        </w:rPr>
+        <w:t>A.S, A.S.</w:t>
+      </w:r>
+      <w:r>
+        <w:rPr>
+          <w:rFonts w:ascii="Garamond" w:hAnsi="Garamond"/>
+          <w:i/>
+          <w:iCs/>
+          <w:sz w:val="18"/>
+          <w:szCs w:val="18"/>
+        </w:rPr>
+        <w:t xml:space="preserve">, </w:t>
+      </w:r>
+      <w:r>
+        <w:rPr>
+          <w:rFonts w:ascii="Garamond" w:hAnsi="Garamond"/>
+          <w:i/>
+          <w:iCs/>
+          <w:sz w:val="18"/>
+          <w:szCs w:val="18"/>
+        </w:rPr>
+        <w:t>Computer Science, Mathematics – Dual Degrees</w:t>
+      </w:r>
+      <w:r>
+        <w:rPr>
+          <w:rFonts w:ascii="Garamond" w:hAnsi="Garamond"/>
+          <w:i/>
+          <w:iCs/>
+          <w:sz w:val="18"/>
+          <w:szCs w:val="18"/>
+        </w:rPr>
+        <w:t xml:space="preserve">, </w:t>
+      </w:r>
+      <w:r>
+        <w:rPr>
+          <w:rFonts w:ascii="Garamond" w:hAnsi="Garamond"/>
+          <w:sz w:val="18"/>
+          <w:szCs w:val="18"/>
+        </w:rPr>
+        <w:t>May</w:t>
+      </w:r>
+      <w:r>
+        <w:rPr>
+          <w:rFonts w:ascii="Garamond" w:hAnsi="Garamond"/>
+          <w:sz w:val="18"/>
+          <w:szCs w:val="18"/>
+        </w:rPr>
+        <w:t xml:space="preserve"> 20</w:t>
+      </w:r>
+      <w:r>
+        <w:rPr>
+          <w:rFonts w:ascii="Garamond" w:hAnsi="Garamond"/>
+          <w:sz w:val="18"/>
+          <w:szCs w:val="18"/>
+        </w:rPr>
+        <w:t>10</w:t>
       </w:r>
       <w:r>
         <w:rPr>
@@ -1406,82 +1508,6 @@
           <w:szCs w:val="18"/>
         </w:rPr>
         <w:t>N.J.</w:t>
-      </w:r>
-    </w:p>
-    <w:p>
-      <w:pPr>
-        <w:tabs>
-          <w:tab w:val="right" w:pos="10800"/>
-        </w:tabs>
-        <w:ind w:firstLine="360"/>
-        <w:rPr>
-          <w:rFonts w:ascii="Garamond" w:hAnsi="Garamond"/>
-          <w:sz w:val="18"/>
-          <w:szCs w:val="18"/>
-        </w:rPr>
-      </w:pPr>
-      <w:r>
-        <w:rPr>
-          <w:rFonts w:ascii="Garamond" w:hAnsi="Garamond"/>
-          <w:i/>
-          <w:iCs/>
-          <w:sz w:val="18"/>
-          <w:szCs w:val="18"/>
-        </w:rPr>
-        <w:t>A.S, A.S.</w:t>
-      </w:r>
-      <w:r>
-        <w:rPr>
-          <w:rFonts w:ascii="Garamond" w:hAnsi="Garamond"/>
-          <w:i/>
-          <w:iCs/>
-          <w:sz w:val="18"/>
-          <w:szCs w:val="18"/>
-        </w:rPr>
-        <w:t xml:space="preserve">, </w:t>
-      </w:r>
-      <w:r>
-        <w:rPr>
-          <w:rFonts w:ascii="Garamond" w:hAnsi="Garamond"/>
-          <w:i/>
-          <w:iCs/>
-          <w:sz w:val="18"/>
-          <w:szCs w:val="18"/>
-        </w:rPr>
-        <w:t>Computer Science, Mathematics – Dual Degrees</w:t>
-      </w:r>
-      <w:r>
-        <w:rPr>
-          <w:rFonts w:ascii="Garamond" w:hAnsi="Garamond"/>
-          <w:iCs/>
-          <w:sz w:val="18"/>
-          <w:szCs w:val="18"/>
-        </w:rPr>
-        <w:tab/>
-      </w:r>
-      <w:r>
-        <w:rPr>
-          <w:rFonts w:ascii="Garamond" w:hAnsi="Garamond"/>
-          <w:sz w:val="18"/>
-          <w:szCs w:val="18"/>
-        </w:rPr>
-        <w:t>May</w:t>
-      </w:r>
-      <w:r>
-        <w:rPr>
-          <w:rFonts w:ascii="Garamond" w:hAnsi="Garamond"/>
-          <w:sz w:val="18"/>
-          <w:szCs w:val="18"/>
-        </w:rPr>
-        <w:t xml:space="preserve"> 20</w:t>
-      </w:r>
-      <w:r>
-        <w:rPr>
-          <w:rFonts w:ascii="Garamond" w:hAnsi="Garamond"/>
-          <w:sz w:val="18"/>
-          <w:szCs w:val="18"/>
-        </w:rPr>
-        <w:t>10</w:t>
       </w:r>
     </w:p>
     <w:p>
@@ -1494,8 +1520,8 @@
           <w:rFonts w:ascii="Garamond" w:hAnsi="Garamond"/>
           <w:b/>
           <w:bCs/>
-          <w:sz w:val="16"/>
-          <w:szCs w:val="16"/>
+          <w:sz w:val="8"/>
+          <w:szCs w:val="8"/>
         </w:rPr>
       </w:pPr>
     </w:p>
@@ -1970,8 +1996,8 @@
           <w:rFonts w:ascii="Garamond" w:hAnsi="Garamond"/>
           <w:b/>
           <w:bCs/>
-          <w:sz w:val="18"/>
-          <w:szCs w:val="18"/>
+          <w:sz w:val="16"/>
+          <w:szCs w:val="16"/>
         </w:rPr>
       </w:pPr>
     </w:p>
@@ -2217,8 +2243,8 @@
           <w:rFonts w:ascii="Garamond" w:hAnsi="Garamond"/>
           <w:b/>
           <w:bCs/>
-          <w:sz w:val="18"/>
-          <w:szCs w:val="18"/>
+          <w:sz w:val="16"/>
+          <w:szCs w:val="16"/>
         </w:rPr>
       </w:pPr>
     </w:p>
@@ -2545,8 +2571,8 @@
           <w:rFonts w:ascii="Garamond" w:hAnsi="Garamond"/>
           <w:b/>
           <w:bCs/>
-          <w:sz w:val="18"/>
-          <w:szCs w:val="18"/>
+          <w:sz w:val="16"/>
+          <w:szCs w:val="16"/>
         </w:rPr>
       </w:pPr>
     </w:p>
@@ -2778,8 +2804,8 @@
           <w:rFonts w:ascii="Garamond" w:hAnsi="Garamond"/>
           <w:b/>
           <w:bCs/>
-          <w:sz w:val="18"/>
-          <w:szCs w:val="18"/>
+          <w:sz w:val="16"/>
+          <w:szCs w:val="16"/>
         </w:rPr>
       </w:pPr>
     </w:p>
@@ -3083,6 +3109,8 @@
           <w:rFonts w:ascii="Garamond" w:hAnsi="Garamond"/>
           <w:b/>
           <w:bCs/>
+          <w:sz w:val="16"/>
+          <w:szCs w:val="16"/>
         </w:rPr>
       </w:pPr>
     </w:p>
@@ -3156,6 +3184,98 @@
           <w:rFonts w:ascii="Garamond" w:hAnsi="Garamond"/>
           <w:b/>
           <w:bCs/>
+          <w:sz w:val="4"/>
+          <w:szCs w:val="4"/>
+        </w:rPr>
+      </w:pPr>
+    </w:p>
+    <w:p>
+      <w:pPr>
+        <w:pBdr>
+          <w:bottom w:val="single" w:sz="12" w:space="1" w:color="auto"/>
+        </w:pBdr>
+        <w:tabs>
+          <w:tab w:val="right" w:pos="10800"/>
+        </w:tabs>
+        <w:spacing w:before="40"/>
+        <w:rPr>
+          <w:rFonts w:ascii="Garamond" w:hAnsi="Garamond"/>
+          <w:b/>
+          <w:bCs/>
+        </w:rPr>
+      </w:pPr>
+      <w:r>
+        <w:rPr>
+          <w:rFonts w:ascii="Garamond" w:hAnsi="Garamond"/>
+          <w:b/>
+          <w:bCs/>
+        </w:rPr>
+        <w:t>PROFESSIONAL</w:t>
+      </w:r>
+      <w:r>
+        <w:rPr>
+          <w:rFonts w:ascii="Garamond" w:hAnsi="Garamond"/>
+          <w:b/>
+          <w:bCs/>
+        </w:rPr>
+        <w:t xml:space="preserve"> </w:t>
+      </w:r>
+      <w:r>
+        <w:rPr>
+          <w:rFonts w:ascii="Garamond" w:hAnsi="Garamond"/>
+          <w:b/>
+          <w:bCs/>
+        </w:rPr>
+        <w:t>DEVELOPMENT</w:t>
+      </w:r>
+    </w:p>
+    <w:p>
+      <w:pPr>
+        <w:tabs>
+          <w:tab w:val="right" w:pos="10800"/>
+        </w:tabs>
+        <w:rPr>
+          <w:rFonts w:ascii="Garamond" w:hAnsi="Garamond"/>
+          <w:b/>
+          <w:bCs/>
+        </w:rPr>
+      </w:pPr>
+      <w:r>
+        <w:rPr>
+          <w:rFonts w:ascii="Garamond" w:hAnsi="Garamond"/>
+          <w:b/>
+          <w:bCs/>
+          <w:sz w:val="20"/>
+          <w:szCs w:val="20"/>
+        </w:rPr>
+        <w:t>Continuous Learning and Growth</w:t>
+      </w:r>
+      <w:r>
+        <w:rPr>
+          <w:rFonts w:ascii="Garamond" w:hAnsi="Garamond"/>
+          <w:b/>
+          <w:bCs/>
+          <w:sz w:val="20"/>
+          <w:szCs w:val="20"/>
+        </w:rPr>
+        <w:t>; TutorialsPoint.Com, and Selected Learning Platforms</w:t>
+      </w:r>
+    </w:p>
+    <w:p>
+      <w:pPr>
+        <w:pBdr>
+          <w:bottom w:val="single" w:sz="12" w:space="1" w:color="auto"/>
+        </w:pBdr>
+        <w:tabs>
+          <w:tab w:val="right" w:pos="10800"/>
+        </w:tabs>
+        <w:spacing w:before="40"/>
+        <w:rPr>
+          <w:rFonts w:ascii="Garamond" w:hAnsi="Garamond"/>
+          <w:b/>
+          <w:bCs/>
+          <w:sz w:val="8"/>
+          <w:szCs w:val="8"/>
         </w:rPr>
       </w:pPr>
     </w:p>

</xml_diff>